<commit_message>
Revise GAM and update repo
</commit_message>
<xml_diff>
--- a/SPLINTER_UserGuidelines.docx
+++ b/SPLINTER_UserGuidelines.docx
@@ -679,7 +679,14 @@
           <w:rFonts w:asciiTheme="minorHAnsi" w:hAnsiTheme="minorHAnsi" w:cs="Times New Roman" w:hint="eastAsia"/>
           <w:lang w:eastAsia="zh-CN"/>
         </w:rPr>
-        <w:t>01</w:t>
+        <w:t>0</w:t>
+      </w:r>
+      <w:r>
+        <w:rPr>
+          <w:rFonts w:asciiTheme="minorHAnsi" w:hAnsiTheme="minorHAnsi" w:cs="Times New Roman" w:hint="eastAsia"/>
+          <w:lang w:eastAsia="zh-CN"/>
+        </w:rPr>
+        <w:t>3</w:t>
       </w:r>
       <w:r>
         <w:rPr>

</xml_diff>